<commit_message>
Supervisor fixes: Task 11 demo app, lab fixes, Docker Hub preload
- Redis: emptyDir volume at /data and --appendonly yes (Task 11)
- API: busybox httpd; /cgi-bin/visits writes a visit counter to Redis (Task 11)
- Failure tests: print "DSYS601 test: ..." instead of "Task 9: ..."
- Lab 0: new Step 16 downloads Lab 1 images before class (labs/preload-images.sh)
- setup-cluster.sh copies preloaded Lab 1 images into the cluster
- Lab 1: note about preloaded images
- Lab 2: updated for the new API, Redis volume and optional extra
- Labs 3 and 4: removed missing optional extra, fixed step numbers
- Lab 5: "Before this lab" now says Labs 3 and 4
</commit_message>
<xml_diff>
--- a/project-docs/05-student-lab-handouts/DSYS601 Lab0 Set up VM.docx
+++ b/project-docs/05-student-lab-handouts/DSYS601 Lab0 Set up VM.docx
@@ -160,7 +160,7 @@
           </w:tcPr>
           <w:p wp14:textId="77777777">
             <w:r>
-              <w:t xml:space="preserve">About 45–60 minutes, mostly waiting for downloads. Do it once, before Lab 1.</w:t>
+              <w:t xml:space="preserve">About 50–70 minutes, mostly waiting for downloads. Do it once, before Lab 1.</w:t>
             </w:r>
           </w:p>
         </w:tc>
@@ -4109,6 +4109,27 @@
         <w:t>.</w:t>
       </w:r>
     </w:p>
+    <w:p xmlns:wp14="http://schemas.microsoft.com/office/word/2010/wordml" wp14:textId="77777777">
+      <w:pPr>
+        <w:keepNext w:val="1"/>
+        <w:spacing w:before="160" w:after="80"/>
+      </w:pPr>
+      <w:r>
+        <w:rPr>
+          <w:b w:val="1"/>
+          <w:bCs w:val="1"/>
+          <w:color w:val="2E5C8A"/>
+          <w:lang w:val="en-US"/>
+        </w:rPr>
+        <w:t xml:space="preserve">Step 16  </w:t>
+      </w:r>
+      <w:r>
+        <w:rPr>
+          <w:lang w:val="en-US"/>
+        </w:rPr>
+        <w:t>Download the images Lab 1 needs. Do this at home or before class, not all together in class: if the whole class downloads at once, Docker Hub can block the downloads.</w:t>
+      </w:r>
+    </w:p>
     <w:tbl>
       <w:tblPr>
         <w:tblW w:w="9638" w:type="dxa"/>
@@ -4133,6 +4154,196 @@
           <w:tcPr>
             <w:tcW w:w="9638" w:type="dxa"/>
             <w:tcBorders>
+              <w:top w:val="single" w:color="BFBFBF" w:sz="4"/>
+              <w:left w:val="single" w:color="BFBFBF" w:sz="4"/>
+              <w:bottom w:val="single" w:color="BFBFBF" w:sz="4"/>
+              <w:right w:val="single" w:color="BFBFBF" w:sz="4"/>
+            </w:tcBorders>
+            <w:shd w:val="clear" w:color="auto" w:fill="F2F2F2"/>
+            <w:tcMar>
+              <w:top w:w="80" w:type="dxa"/>
+              <w:left w:w="140" w:type="dxa"/>
+              <w:bottom w:w="80" w:type="dxa"/>
+              <w:right w:w="140" w:type="dxa"/>
+            </w:tcMar>
+          </w:tcPr>
+          <w:p>
+            <w:pPr>
+              <w:keepNext w:val="1"/>
+              <w:spacing w:after="0"/>
+            </w:pPr>
+            <w:r>
+              <w:rPr>
+                <w:rFonts w:ascii="Consolas" w:hAnsi="Consolas" w:eastAsia="Consolas" w:cs="Consolas"/>
+                <w:sz w:val="19"/>
+                <w:szCs w:val="19"/>
+                <w:lang w:val="en-US"/>
+              </w:rPr>
+              <w:t xml:space="preserve">./labs/preload-images.sh</w:t>
+            </w:r>
+          </w:p>
+        </w:tc>
+      </w:tr>
+    </w:tbl>
+    <w:p xmlns:wp14="http://schemas.microsoft.com/office/word/2010/wordml" wp14:textId="77777777">
+      <w:pPr>
+        <w:spacing w:after="60"/>
+      </w:pPr>
+    </w:p>
+    <w:tbl>
+      <w:tblPr>
+        <w:tblW w:w="9638" w:type="dxa"/>
+        <w:tblBorders>
+          <w:top w:val="single" w:color="auto" w:sz="4"/>
+          <w:left w:val="single" w:color="auto" w:sz="4"/>
+          <w:bottom w:val="single" w:color="auto" w:sz="4"/>
+          <w:right w:val="single" w:color="auto" w:sz="4"/>
+          <w:insideH w:val="single" w:color="auto" w:sz="4"/>
+          <w:insideV w:val="single" w:color="auto" w:sz="4"/>
+        </w:tblBorders>
+        <w:tblLayout w:type="fixed"/>
+      </w:tblPr>
+      <w:tblGrid>
+        <w:gridCol w:w="9638"/>
+      </w:tblGrid>
+      <w:tr xmlns:wp14="http://schemas.microsoft.com/office/word/2010/wordml" wp14:textId="77777777">
+        <w:trPr>
+          <w:cantSplit/>
+        </w:trPr>
+        <w:tc>
+          <w:tcPr>
+            <w:tcW w:w="9638" w:type="dxa"/>
+            <w:tcBorders>
+              <w:top w:val="single" w:color="A6A6A6" w:sz="4"/>
+              <w:left w:val="single" w:color="A6A6A6" w:sz="4"/>
+              <w:bottom w:val="single" w:color="A6A6A6" w:sz="4"/>
+              <w:right w:val="single" w:color="A6A6A6" w:sz="4"/>
+            </w:tcBorders>
+            <w:shd w:val="clear" w:color="auto" w:fill="FFFFFF"/>
+            <w:tcMar>
+              <w:top w:w="80" w:type="dxa"/>
+              <w:left w:w="140" w:type="dxa"/>
+              <w:bottom w:w="80" w:type="dxa"/>
+              <w:right w:w="140" w:type="dxa"/>
+            </w:tcMar>
+          </w:tcPr>
+          <w:p wp14:textId="77777777">
+            <w:pPr>
+              <w:keepNext/>
+              <w:spacing w:after="60"/>
+            </w:pPr>
+            <w:r>
+              <w:rPr>
+                <w:color w:val="595959"/>
+                <w:sz w:val="16"/>
+                <w:szCs w:val="16"/>
+              </w:rPr>
+              <w:t xml:space="preserve">Expected output (yours may differ slightly)</w:t>
+            </w:r>
+          </w:p>
+          <w:p>
+            <w:pPr>
+              <w:keepNext w:val="1"/>
+              <w:spacing w:after="0"/>
+            </w:pPr>
+            <w:r>
+              <w:rPr>
+                <w:rFonts w:ascii="Consolas" w:hAnsi="Consolas" w:eastAsia="Consolas" w:cs="Consolas"/>
+                <w:sz w:val="19"/>
+                <w:szCs w:val="19"/>
+                <w:lang w:val="en-US"/>
+              </w:rPr>
+              <w:t xml:space="preserve">Downloading kindest/node:v1.37.0</w:t>
+            </w:r>
+          </w:p>
+          <w:p>
+            <w:pPr>
+              <w:keepNext w:val="1"/>
+              <w:spacing w:after="0"/>
+            </w:pPr>
+            <w:r>
+              <w:rPr>
+                <w:rFonts w:ascii="Consolas" w:hAnsi="Consolas" w:eastAsia="Consolas" w:cs="Consolas"/>
+                <w:sz w:val="19"/>
+                <w:szCs w:val="19"/>
+                <w:lang w:val="en-US"/>
+              </w:rPr>
+              <w:t xml:space="preserve">Downloading nginx:1.27-alpine</w:t>
+            </w:r>
+          </w:p>
+          <w:p>
+            <w:pPr>
+              <w:keepNext w:val="1"/>
+              <w:spacing w:after="0"/>
+            </w:pPr>
+            <w:r>
+              <w:rPr>
+                <w:rFonts w:ascii="Consolas" w:hAnsi="Consolas" w:eastAsia="Consolas" w:cs="Consolas"/>
+                <w:sz w:val="19"/>
+                <w:szCs w:val="19"/>
+                <w:lang w:val="en-US"/>
+              </w:rPr>
+              <w:t xml:space="preserve">Downloading nginx:1.28-alpine</w:t>
+            </w:r>
+          </w:p>
+          <w:p>
+            <w:pPr>
+              <w:keepNext w:val="1"/>
+              <w:spacing w:after="0"/>
+            </w:pPr>
+            <w:r>
+              <w:rPr>
+                <w:rFonts w:ascii="Consolas" w:hAnsi="Consolas" w:eastAsia="Consolas" w:cs="Consolas"/>
+                <w:sz w:val="19"/>
+                <w:szCs w:val="19"/>
+                <w:lang w:val="en-US"/>
+              </w:rPr>
+              <w:t xml:space="preserve">DONE: Lab 1 images are saved on this VM</w:t>
+            </w:r>
+          </w:p>
+        </w:tc>
+      </w:tr>
+    </w:tbl>
+    <w:p xmlns:wp14="http://schemas.microsoft.com/office/word/2010/wordml" wp14:textId="77777777">
+      <w:pPr>
+        <w:spacing w:after="60"/>
+      </w:pPr>
+    </w:p>
+    <w:p xmlns:wp14="http://schemas.microsoft.com/office/word/2010/wordml" wp14:textId="77777777">
+      <w:pPr>
+        <w:spacing w:after="120"/>
+      </w:pPr>
+      <w:r>
+        <w:rPr>
+          <w:lang w:val="en-US"/>
+        </w:rPr>
+        <w:t xml:space="preserve">It downloads a few hundred MB, so it can take 5–10 minutes. Lab 1 copies these images into your cluster for you, so Lab 1 starts faster.</w:t>
+      </w:r>
+    </w:p>
+    <w:tbl>
+      <w:tblPr>
+        <w:tblW w:w="9638" w:type="dxa"/>
+        <w:tblBorders>
+          <w:top w:val="single" w:color="auto" w:sz="4"/>
+          <w:left w:val="single" w:color="auto" w:sz="4"/>
+          <w:bottom w:val="single" w:color="auto" w:sz="4"/>
+          <w:right w:val="single" w:color="auto" w:sz="4"/>
+          <w:insideH w:val="single" w:color="auto" w:sz="4"/>
+          <w:insideV w:val="single" w:color="auto" w:sz="4"/>
+        </w:tblBorders>
+        <w:tblLayout w:type="fixed"/>
+      </w:tblPr>
+      <w:tblGrid>
+        <w:gridCol w:w="9638"/>
+      </w:tblGrid>
+      <w:tr xmlns:wp14="http://schemas.microsoft.com/office/word/2010/wordml" wp14:textId="77777777">
+        <w:trPr>
+          <w:cantSplit/>
+        </w:trPr>
+        <w:tc>
+          <w:tcPr>
+            <w:tcW w:w="9638" w:type="dxa"/>
+            <w:tcBorders>
               <w:top w:val="single" w:color="A9D18E" w:sz="4"/>
               <w:left w:val="single" w:color="A9D18E" w:sz="4"/>
               <w:bottom w:val="single" w:color="A9D18E" w:sz="4"/>
@@ -4325,7 +4536,24 @@
         <w:rPr>
           <w:lang w:val="en-US"/>
         </w:rPr>
-        <w:t>the cgroup check shows all five words.</w:t>
+        <w:t xml:space="preserve">the cgroup check shows all five words;</w:t>
+      </w:r>
+    </w:p>
+    <w:p xmlns:wp14="http://schemas.microsoft.com/office/word/2010/wordml" wp14:textId="77777777">
+      <w:pPr>
+        <w:pStyle w:val="ListParagraph"/>
+        <w:numPr>
+          <w:ilvl w:val="0"/>
+          <w:numId w:val="2"/>
+        </w:numPr>
+        <w:spacing w:after="60"/>
+        <w:rPr/>
+      </w:pPr>
+      <w:r>
+        <w:rPr>
+          <w:lang w:val="en-US"/>
+        </w:rPr>
+        <w:t xml:space="preserve">./labs/preload-images.sh printed DONE.</w:t>
       </w:r>
     </w:p>
     <w:p xmlns:wp14="http://schemas.microsoft.com/office/word/2010/wordml" wp14:textId="6A3CE267">

</xml_diff>